<commit_message>
change signature w and h
</commit_message>
<xml_diff>
--- a/app/public/templates/Commissaire-aux-comptes-avec-retard.docx
+++ b/app/public/templates/Commissaire-aux-comptes-avec-retard.docx
@@ -387,23 +387,7 @@
         <w:rPr>
           <w:rFonts w:ascii="Arial" w:hAnsi="Arial" w:cs="Arial"/>
         </w:rPr>
-        <w:t>{</w:t>
-      </w:r>
-      <w:proofErr w:type="spellStart"/>
-      <w:proofErr w:type="gramStart"/>
-      <w:r>
-        <w:rPr>
-          <w:rFonts w:ascii="Arial" w:hAnsi="Arial" w:cs="Arial"/>
-        </w:rPr>
-        <w:t>raisonSociale</w:t>
-      </w:r>
-      <w:proofErr w:type="spellEnd"/>
-      <w:proofErr w:type="gramEnd"/>
-      <w:r>
-        <w:rPr>
-          <w:rFonts w:ascii="Arial" w:hAnsi="Arial" w:cs="Arial"/>
-        </w:rPr>
-        <w:t>}</w:t>
+        <w:t>{raisonSociale}</w:t>
       </w:r>
     </w:p>
     <w:p>
@@ -487,9 +471,8 @@
           <w:sz w:val="22"/>
           <w:szCs w:val="22"/>
         </w:rPr>
-        <w:t>{</w:t>
-      </w:r>
-      <w:proofErr w:type="spellStart"/>
+        <w:t>{jourDebut}</w:t>
+      </w:r>
       <w:r>
         <w:rPr>
           <w:rFonts w:ascii="Arial" w:hAnsi="Arial" w:cs="Arial"/>
@@ -497,10 +480,10 @@
           <w:bCs/>
           <w:sz w:val="22"/>
           <w:szCs w:val="22"/>
-        </w:rPr>
-        <w:t>jourDebut</w:t>
-      </w:r>
-      <w:proofErr w:type="spellEnd"/>
+          <w:vertAlign w:val="superscript"/>
+        </w:rPr>
+        <w:t>{exposantDebut}</w:t>
+      </w:r>
       <w:r>
         <w:rPr>
           <w:rFonts w:ascii="Arial" w:hAnsi="Arial" w:cs="Arial"/>
@@ -509,74 +492,7 @@
           <w:sz w:val="22"/>
           <w:szCs w:val="22"/>
         </w:rPr>
-        <w:t>}</w:t>
-      </w:r>
-      <w:r>
-        <w:rPr>
-          <w:rFonts w:ascii="Arial" w:hAnsi="Arial" w:cs="Arial"/>
-          <w:b/>
-          <w:bCs/>
-          <w:sz w:val="22"/>
-          <w:szCs w:val="22"/>
-          <w:vertAlign w:val="superscript"/>
-        </w:rPr>
-        <w:t>{</w:t>
-      </w:r>
-      <w:proofErr w:type="spellStart"/>
-      <w:r>
-        <w:rPr>
-          <w:rFonts w:ascii="Arial" w:hAnsi="Arial" w:cs="Arial"/>
-          <w:b/>
-          <w:bCs/>
-          <w:sz w:val="22"/>
-          <w:szCs w:val="22"/>
-          <w:vertAlign w:val="superscript"/>
-        </w:rPr>
-        <w:t>exposantDebut</w:t>
-      </w:r>
-      <w:proofErr w:type="spellEnd"/>
-      <w:r>
-        <w:rPr>
-          <w:rFonts w:ascii="Arial" w:hAnsi="Arial" w:cs="Arial"/>
-          <w:b/>
-          <w:bCs/>
-          <w:sz w:val="22"/>
-          <w:szCs w:val="22"/>
-          <w:vertAlign w:val="superscript"/>
-        </w:rPr>
-        <w:t>}</w:t>
-      </w:r>
-      <w:r>
-        <w:rPr>
-          <w:rFonts w:ascii="Arial" w:hAnsi="Arial" w:cs="Arial"/>
-          <w:b/>
-          <w:bCs/>
-          <w:sz w:val="22"/>
-          <w:szCs w:val="22"/>
-        </w:rPr>
-        <w:t>{</w:t>
-      </w:r>
-      <w:proofErr w:type="spellStart"/>
-      <w:r>
-        <w:rPr>
-          <w:rFonts w:ascii="Arial" w:hAnsi="Arial" w:cs="Arial"/>
-          <w:b/>
-          <w:bCs/>
-          <w:sz w:val="22"/>
-          <w:szCs w:val="22"/>
-        </w:rPr>
-        <w:t>finCouverture</w:t>
-      </w:r>
-      <w:proofErr w:type="spellEnd"/>
-      <w:r>
-        <w:rPr>
-          <w:rFonts w:ascii="Arial" w:hAnsi="Arial" w:cs="Arial"/>
-          <w:b/>
-          <w:bCs/>
-          <w:sz w:val="22"/>
-          <w:szCs w:val="22"/>
-        </w:rPr>
-        <w:t>}</w:t>
+        <w:t>{finCouverture}</w:t>
       </w:r>
     </w:p>
     <w:p>
@@ -1001,9 +917,18 @@
           <w:sz w:val="24"/>
           <w:szCs w:val="24"/>
         </w:rPr>
-        <w:t>{</w:t>
-      </w:r>
-      <w:proofErr w:type="spellStart"/>
+        <w:t>{civilite}</w:t>
+      </w:r>
+      <w:r>
+        <w:rPr>
+          <w:rFonts w:ascii="Aptos" w:hAnsi="Aptos" w:cs="Arial"/>
+          <w:b/>
+          <w:bCs/>
+          <w:sz w:val="24"/>
+          <w:szCs w:val="24"/>
+        </w:rPr>
+        <w:t xml:space="preserve"> </w:t>
+      </w:r>
       <w:r>
         <w:rPr>
           <w:rFonts w:ascii="Aptos" w:hAnsi="Aptos"/>
@@ -1012,60 +937,7 @@
           <w:sz w:val="24"/>
           <w:szCs w:val="24"/>
         </w:rPr>
-        <w:t>civilite</w:t>
-      </w:r>
-      <w:proofErr w:type="spellEnd"/>
-      <w:r>
-        <w:rPr>
-          <w:rFonts w:ascii="Aptos" w:hAnsi="Aptos"/>
-          <w:b/>
-          <w:bCs/>
-          <w:sz w:val="24"/>
-          <w:szCs w:val="24"/>
-        </w:rPr>
-        <w:t>}</w:t>
-      </w:r>
-      <w:r>
-        <w:rPr>
-          <w:rFonts w:ascii="Aptos" w:hAnsi="Aptos" w:cs="Arial"/>
-          <w:b/>
-          <w:bCs/>
-          <w:sz w:val="24"/>
-          <w:szCs w:val="24"/>
-        </w:rPr>
-        <w:t xml:space="preserve"> </w:t>
-      </w:r>
-      <w:r>
-        <w:rPr>
-          <w:rFonts w:ascii="Aptos" w:hAnsi="Aptos"/>
-          <w:b/>
-          <w:bCs/>
-          <w:sz w:val="24"/>
-          <w:szCs w:val="24"/>
-        </w:rPr>
-        <w:t>{</w:t>
-      </w:r>
-      <w:proofErr w:type="spellStart"/>
-      <w:r>
-        <w:rPr>
-          <w:rFonts w:ascii="Aptos" w:hAnsi="Aptos"/>
-          <w:b/>
-          <w:bCs/>
-          <w:sz w:val="24"/>
-          <w:szCs w:val="24"/>
-        </w:rPr>
-        <w:t>pdg</w:t>
-      </w:r>
-      <w:proofErr w:type="spellEnd"/>
-      <w:r>
-        <w:rPr>
-          <w:rFonts w:ascii="Aptos" w:hAnsi="Aptos"/>
-          <w:b/>
-          <w:bCs/>
-          <w:sz w:val="24"/>
-          <w:szCs w:val="24"/>
-        </w:rPr>
-        <w:t>}</w:t>
+        <w:t>{pdg}</w:t>
       </w:r>
     </w:p>
     <w:p>
@@ -1088,29 +960,7 @@
           <w:sz w:val="24"/>
           <w:szCs w:val="24"/>
         </w:rPr>
-        <w:t>{</w:t>
-      </w:r>
-      <w:proofErr w:type="spellStart"/>
-      <w:proofErr w:type="gramStart"/>
-      <w:r>
-        <w:rPr>
-          <w:b/>
-          <w:bCs/>
-          <w:sz w:val="24"/>
-          <w:szCs w:val="24"/>
-        </w:rPr>
-        <w:t>titrePdg</w:t>
-      </w:r>
-      <w:proofErr w:type="spellEnd"/>
-      <w:proofErr w:type="gramEnd"/>
-      <w:r>
-        <w:rPr>
-          <w:b/>
-          <w:bCs/>
-          <w:sz w:val="24"/>
-          <w:szCs w:val="24"/>
-        </w:rPr>
-        <w:t>}</w:t>
+        <w:t>{titrePdg}</w:t>
       </w:r>
       <w:r>
         <w:rPr>
@@ -1130,31 +980,7 @@
           <w:szCs w:val="24"/>
           <w:lang w:val="en-US"/>
         </w:rPr>
-        <w:t>{</w:t>
-      </w:r>
-      <w:proofErr w:type="spellStart"/>
-      <w:r>
-        <w:rPr>
-          <w:rFonts w:ascii="Aptos" w:hAnsi="Aptos"/>
-          <w:b/>
-          <w:bCs/>
-          <w:sz w:val="24"/>
-          <w:szCs w:val="24"/>
-          <w:lang w:val="en-US"/>
-        </w:rPr>
-        <w:t>raisonSociale</w:t>
-      </w:r>
-      <w:proofErr w:type="spellEnd"/>
-      <w:r>
-        <w:rPr>
-          <w:rFonts w:ascii="Aptos" w:hAnsi="Aptos"/>
-          <w:b/>
-          <w:bCs/>
-          <w:sz w:val="24"/>
-          <w:szCs w:val="24"/>
-          <w:lang w:val="en-US"/>
-        </w:rPr>
-        <w:t>}</w:t>
+        <w:t>{raisonSociale}</w:t>
       </w:r>
     </w:p>
     <w:p>
@@ -1166,7 +992,6 @@
           <w:color w:val="000000"/>
           <w:sz w:val="24"/>
           <w:szCs w:val="24"/>
-          <w:lang/>
         </w:rPr>
       </w:pPr>
       <w:r>
@@ -1175,25 +1000,7 @@
           <w:sz w:val="24"/>
           <w:szCs w:val="24"/>
         </w:rPr>
-        <w:t>{</w:t>
-      </w:r>
-      <w:proofErr w:type="gramStart"/>
-      <w:r>
-        <w:rPr>
-          <w:rFonts w:ascii="Aptos" w:hAnsi="Aptos"/>
-          <w:sz w:val="24"/>
-          <w:szCs w:val="24"/>
-        </w:rPr>
-        <w:t>adresse</w:t>
-      </w:r>
-      <w:proofErr w:type="gramEnd"/>
-      <w:r>
-        <w:rPr>
-          <w:rFonts w:ascii="Aptos" w:hAnsi="Aptos"/>
-          <w:sz w:val="24"/>
-          <w:szCs w:val="24"/>
-        </w:rPr>
-        <w:t>}</w:t>
+        <w:t>{adresse}</w:t>
       </w:r>
     </w:p>
     <w:p>
@@ -1205,7 +1012,6 @@
           <w:color w:val="000000"/>
           <w:sz w:val="24"/>
           <w:szCs w:val="24"/>
-          <w:lang/>
         </w:rPr>
       </w:pPr>
     </w:p>
@@ -1339,29 +1145,7 @@
           <w:sz w:val="24"/>
           <w:szCs w:val="24"/>
         </w:rPr>
-        <w:t>{</w:t>
-      </w:r>
-      <w:proofErr w:type="spellStart"/>
-      <w:r>
-        <w:rPr>
-          <w:rFonts w:ascii="Aptos" w:hAnsi="Aptos"/>
-          <w:b/>
-          <w:bCs/>
-          <w:sz w:val="24"/>
-          <w:szCs w:val="24"/>
-        </w:rPr>
-        <w:t>periodeCourte</w:t>
-      </w:r>
-      <w:proofErr w:type="spellEnd"/>
-      <w:r>
-        <w:rPr>
-          <w:rFonts w:ascii="Aptos" w:hAnsi="Aptos"/>
-          <w:b/>
-          <w:bCs/>
-          <w:sz w:val="24"/>
-          <w:szCs w:val="24"/>
-        </w:rPr>
-        <w:t>}</w:t>
+        <w:t>{periodeCourte}</w:t>
       </w:r>
     </w:p>
     <w:p>
@@ -1410,9 +1194,72 @@
           <w:sz w:val="24"/>
           <w:szCs w:val="24"/>
         </w:rPr>
-        <w:t>{</w:t>
-      </w:r>
-      <w:proofErr w:type="spellStart"/>
+        <w:t>{raisonSociale}</w:t>
+      </w:r>
+      <w:r>
+        <w:rPr>
+          <w:rFonts w:ascii="Aptos" w:hAnsi="Aptos" w:cs="Arial"/>
+          <w:sz w:val="24"/>
+          <w:szCs w:val="24"/>
+        </w:rPr>
+        <w:t xml:space="preserve"> </w:t>
+      </w:r>
+      <w:r>
+        <w:rPr>
+          <w:rFonts w:ascii="Aptos" w:hAnsi="Aptos" w:cs="Arial"/>
+          <w:sz w:val="24"/>
+          <w:szCs w:val="24"/>
+        </w:rPr>
+        <w:t xml:space="preserve">et </w:t>
+      </w:r>
+      <w:r>
+        <w:rPr>
+          <w:rFonts w:ascii="Aptos" w:hAnsi="Aptos" w:cs="Arial"/>
+          <w:sz w:val="24"/>
+          <w:szCs w:val="24"/>
+        </w:rPr>
+        <w:t>en application des</w:t>
+      </w:r>
+      <w:r>
+        <w:rPr>
+          <w:rFonts w:ascii="Aptos" w:hAnsi="Aptos" w:cs="Arial"/>
+          <w:sz w:val="24"/>
+          <w:szCs w:val="24"/>
+        </w:rPr>
+        <w:t xml:space="preserve"> </w:t>
+      </w:r>
+      <w:r>
+        <w:rPr>
+          <w:rFonts w:ascii="Aptos" w:hAnsi="Aptos" w:cs="Arial"/>
+          <w:sz w:val="24"/>
+          <w:szCs w:val="24"/>
+        </w:rPr>
+        <w:t>dispositions de la loi 69-21 relative aux délais de paiement, nous avons vérifié la concordance des</w:t>
+      </w:r>
+      <w:r>
+        <w:rPr>
+          <w:rFonts w:ascii="Aptos" w:hAnsi="Aptos" w:cs="Arial"/>
+          <w:sz w:val="24"/>
+          <w:szCs w:val="24"/>
+        </w:rPr>
+        <w:t xml:space="preserve"> </w:t>
+      </w:r>
+      <w:r>
+        <w:rPr>
+          <w:rFonts w:ascii="Aptos" w:hAnsi="Aptos" w:cs="Arial"/>
+          <w:sz w:val="24"/>
+          <w:szCs w:val="24"/>
+        </w:rPr>
+        <w:t xml:space="preserve">informations, figurant dans l’état joint à la déclaration des délais de paiement, avec les justificatifs des informations figurant sur les factures non payées dans les délais prévus à l’article 2.78 de la loi 69-21 de </w:t>
+      </w:r>
+      <w:r>
+        <w:rPr>
+          <w:rFonts w:ascii="Aptos" w:hAnsi="Aptos" w:cs="Arial"/>
+          <w:sz w:val="24"/>
+          <w:szCs w:val="24"/>
+        </w:rPr>
+        <w:t xml:space="preserve">la société </w:t>
+      </w:r>
       <w:r>
         <w:rPr>
           <w:rFonts w:ascii="Aptos" w:hAnsi="Aptos"/>
@@ -1421,9 +1268,16 @@
           <w:sz w:val="24"/>
           <w:szCs w:val="24"/>
         </w:rPr>
-        <w:t>raisonSociale</w:t>
-      </w:r>
-      <w:proofErr w:type="spellEnd"/>
+        <w:t>{raisonSociale}</w:t>
+      </w:r>
+      <w:r>
+        <w:rPr>
+          <w:rFonts w:ascii="Aptos" w:hAnsi="Aptos" w:cs="Arial"/>
+          <w:sz w:val="24"/>
+          <w:szCs w:val="24"/>
+        </w:rPr>
+        <w:t xml:space="preserve"> au titre de la période du </w:t>
+      </w:r>
       <w:r>
         <w:rPr>
           <w:rFonts w:ascii="Aptos" w:hAnsi="Aptos"/>
@@ -1432,143 +1286,7 @@
           <w:sz w:val="24"/>
           <w:szCs w:val="24"/>
         </w:rPr>
-        <w:t>}</w:t>
-      </w:r>
-      <w:r>
-        <w:rPr>
-          <w:rFonts w:ascii="Aptos" w:hAnsi="Aptos" w:cs="Arial"/>
-          <w:sz w:val="24"/>
-          <w:szCs w:val="24"/>
-        </w:rPr>
-        <w:t xml:space="preserve"> </w:t>
-      </w:r>
-      <w:r>
-        <w:rPr>
-          <w:rFonts w:ascii="Aptos" w:hAnsi="Aptos" w:cs="Arial"/>
-          <w:sz w:val="24"/>
-          <w:szCs w:val="24"/>
-        </w:rPr>
-        <w:t xml:space="preserve">et </w:t>
-      </w:r>
-      <w:r>
-        <w:rPr>
-          <w:rFonts w:ascii="Aptos" w:hAnsi="Aptos" w:cs="Arial"/>
-          <w:sz w:val="24"/>
-          <w:szCs w:val="24"/>
-        </w:rPr>
-        <w:t>en application des</w:t>
-      </w:r>
-      <w:r>
-        <w:rPr>
-          <w:rFonts w:ascii="Aptos" w:hAnsi="Aptos" w:cs="Arial"/>
-          <w:sz w:val="24"/>
-          <w:szCs w:val="24"/>
-        </w:rPr>
-        <w:t xml:space="preserve"> </w:t>
-      </w:r>
-      <w:r>
-        <w:rPr>
-          <w:rFonts w:ascii="Aptos" w:hAnsi="Aptos" w:cs="Arial"/>
-          <w:sz w:val="24"/>
-          <w:szCs w:val="24"/>
-        </w:rPr>
-        <w:t>dispositions de la loi 69-21 relative aux délais de paiement, nous avons vérifié la concordance des</w:t>
-      </w:r>
-      <w:r>
-        <w:rPr>
-          <w:rFonts w:ascii="Aptos" w:hAnsi="Aptos" w:cs="Arial"/>
-          <w:sz w:val="24"/>
-          <w:szCs w:val="24"/>
-        </w:rPr>
-        <w:t xml:space="preserve"> </w:t>
-      </w:r>
-      <w:r>
-        <w:rPr>
-          <w:rFonts w:ascii="Aptos" w:hAnsi="Aptos" w:cs="Arial"/>
-          <w:sz w:val="24"/>
-          <w:szCs w:val="24"/>
-        </w:rPr>
-        <w:t xml:space="preserve">informations, figurant dans l’état joint à la déclaration des délais de paiement, avec les justificatifs des informations figurant sur les factures non payées dans les délais prévus à l’article 2.78 de la loi 69-21 de </w:t>
-      </w:r>
-      <w:r>
-        <w:rPr>
-          <w:rFonts w:ascii="Aptos" w:hAnsi="Aptos" w:cs="Arial"/>
-          <w:sz w:val="24"/>
-          <w:szCs w:val="24"/>
-        </w:rPr>
-        <w:t xml:space="preserve">la société </w:t>
-      </w:r>
-      <w:r>
-        <w:rPr>
-          <w:rFonts w:ascii="Aptos" w:hAnsi="Aptos"/>
-          <w:b/>
-          <w:bCs/>
-          <w:sz w:val="24"/>
-          <w:szCs w:val="24"/>
-        </w:rPr>
-        <w:t>{</w:t>
-      </w:r>
-      <w:proofErr w:type="spellStart"/>
-      <w:r>
-        <w:rPr>
-          <w:rFonts w:ascii="Aptos" w:hAnsi="Aptos"/>
-          <w:b/>
-          <w:bCs/>
-          <w:sz w:val="24"/>
-          <w:szCs w:val="24"/>
-        </w:rPr>
-        <w:t>raisonSociale</w:t>
-      </w:r>
-      <w:proofErr w:type="spellEnd"/>
-      <w:r>
-        <w:rPr>
-          <w:rFonts w:ascii="Aptos" w:hAnsi="Aptos"/>
-          <w:b/>
-          <w:bCs/>
-          <w:sz w:val="24"/>
-          <w:szCs w:val="24"/>
-        </w:rPr>
-        <w:t>}</w:t>
-      </w:r>
-      <w:r>
-        <w:rPr>
-          <w:rFonts w:ascii="Aptos" w:hAnsi="Aptos" w:cs="Arial"/>
-          <w:sz w:val="24"/>
-          <w:szCs w:val="24"/>
-        </w:rPr>
-        <w:t xml:space="preserve"> au titre de la période du </w:t>
-      </w:r>
-      <w:r>
-        <w:rPr>
-          <w:rFonts w:ascii="Aptos" w:hAnsi="Aptos"/>
-          <w:b/>
-          <w:bCs/>
-          <w:sz w:val="24"/>
-          <w:szCs w:val="24"/>
-        </w:rPr>
-        <w:t>{</w:t>
-      </w:r>
-      <w:proofErr w:type="spellStart"/>
-      <w:r>
-        <w:rPr>
-          <w:rFonts w:ascii="Aptos" w:hAnsi="Aptos"/>
-          <w:b/>
-          <w:bCs/>
-          <w:sz w:val="24"/>
-          <w:szCs w:val="24"/>
-        </w:rPr>
-        <w:t>periodeCourte</w:t>
-      </w:r>
-      <w:proofErr w:type="spellEnd"/>
-      <w:r>
-        <w:rPr>
-          <w:rFonts w:ascii="Aptos" w:hAnsi="Aptos"/>
-          <w:b/>
-          <w:bCs/>
-          <w:sz w:val="24"/>
-          <w:szCs w:val="24"/>
-        </w:rPr>
-        <w:t>}</w:t>
+        <w:t>{periodeCourte}</w:t>
       </w:r>
       <w:r>
         <w:rPr>
@@ -1676,29 +1394,7 @@
           <w:sz w:val="24"/>
           <w:szCs w:val="24"/>
         </w:rPr>
-        <w:t>{</w:t>
-      </w:r>
-      <w:proofErr w:type="spellStart"/>
-      <w:r>
-        <w:rPr>
-          <w:rFonts w:ascii="Aptos" w:hAnsi="Aptos"/>
-          <w:b/>
-          <w:bCs/>
-          <w:sz w:val="24"/>
-          <w:szCs w:val="24"/>
-        </w:rPr>
-        <w:t>raisonSociale</w:t>
-      </w:r>
-      <w:proofErr w:type="spellEnd"/>
-      <w:r>
-        <w:rPr>
-          <w:rFonts w:ascii="Aptos" w:hAnsi="Aptos"/>
-          <w:b/>
-          <w:bCs/>
-          <w:sz w:val="24"/>
-          <w:szCs w:val="24"/>
-        </w:rPr>
-        <w:t>}</w:t>
+        <w:t>{raisonSociale}</w:t>
       </w:r>
       <w:r>
         <w:rPr>
@@ -1861,29 +1557,7 @@
           <w:sz w:val="24"/>
           <w:szCs w:val="24"/>
         </w:rPr>
-        <w:t>{</w:t>
-      </w:r>
-      <w:proofErr w:type="spellStart"/>
-      <w:r>
-        <w:rPr>
-          <w:rFonts w:ascii="Aptos" w:hAnsi="Aptos"/>
-          <w:b/>
-          <w:bCs/>
-          <w:sz w:val="24"/>
-          <w:szCs w:val="24"/>
-        </w:rPr>
-        <w:t>raisonSociale</w:t>
-      </w:r>
-      <w:proofErr w:type="spellEnd"/>
-      <w:r>
-        <w:rPr>
-          <w:rFonts w:ascii="Aptos" w:hAnsi="Aptos"/>
-          <w:b/>
-          <w:bCs/>
-          <w:sz w:val="24"/>
-          <w:szCs w:val="24"/>
-        </w:rPr>
-        <w:t>}</w:t>
+        <w:t>{raisonSociale}</w:t>
       </w:r>
       <w:r>
         <w:rPr>
@@ -1901,29 +1575,7 @@
           <w:sz w:val="24"/>
           <w:szCs w:val="24"/>
         </w:rPr>
-        <w:t>{</w:t>
-      </w:r>
-      <w:proofErr w:type="spellStart"/>
-      <w:r>
-        <w:rPr>
-          <w:rFonts w:ascii="Aptos" w:hAnsi="Aptos" w:cs="Arial"/>
-          <w:b/>
-          <w:bCs/>
-          <w:sz w:val="24"/>
-          <w:szCs w:val="24"/>
-        </w:rPr>
-        <w:t>periodeCourte</w:t>
-      </w:r>
-      <w:proofErr w:type="spellEnd"/>
-      <w:r>
-        <w:rPr>
-          <w:rFonts w:ascii="Aptos" w:hAnsi="Aptos" w:cs="Arial"/>
-          <w:b/>
-          <w:bCs/>
-          <w:sz w:val="24"/>
-          <w:szCs w:val="24"/>
-        </w:rPr>
-        <w:t>}</w:t>
+        <w:t>{periodeCourte}</w:t>
       </w:r>
       <w:r>
         <w:rPr>
@@ -2016,88 +1668,40 @@
           <w:u w:val="single"/>
           <w:lang w:eastAsia="fr-FR"/>
         </w:rPr>
-        <w:t>{</w:t>
-      </w:r>
-      <w:proofErr w:type="gramStart"/>
-      <w:r>
-        <w:rPr>
-          <w:rFonts w:ascii="Aptos" w:hAnsi="Aptos" w:cs="Arial"/>
-          <w:kern w:val="2"/>
+        <w:t>{lieu}</w:t>
+      </w:r>
+      <w:r>
+        <w:rPr>
+          <w:rFonts w:ascii="Aptos" w:hAnsi="Aptos" w:cs="Arial"/>
+          <w:kern w:val="32"/>
           <w:sz w:val="24"/>
           <w:szCs w:val="24"/>
           <w:u w:val="single"/>
           <w:lang w:eastAsia="fr-FR"/>
         </w:rPr>
-        <w:t>lieu</w:t>
-      </w:r>
-      <w:proofErr w:type="gramEnd"/>
-      <w:r>
-        <w:rPr>
-          <w:rFonts w:ascii="Aptos" w:hAnsi="Aptos" w:cs="Arial"/>
-          <w:kern w:val="2"/>
+        <w:t xml:space="preserve">, </w:t>
+      </w:r>
+      <w:r>
+        <w:rPr>
+          <w:rFonts w:ascii="Aptos" w:hAnsi="Aptos" w:cs="Arial"/>
+          <w:kern w:val="32"/>
           <w:sz w:val="24"/>
           <w:szCs w:val="24"/>
           <w:u w:val="single"/>
           <w:lang w:eastAsia="fr-FR"/>
         </w:rPr>
-        <w:t>}</w:t>
-      </w:r>
-      <w:r>
-        <w:rPr>
-          <w:rFonts w:ascii="Aptos" w:hAnsi="Aptos" w:cs="Arial"/>
-          <w:kern w:val="32"/>
+        <w:t xml:space="preserve">le </w:t>
+      </w:r>
+      <w:r>
+        <w:rPr>
+          <w:rFonts w:ascii="Aptos" w:hAnsi="Aptos" w:cs="Arial"/>
+          <w:kern w:val="2"/>
           <w:sz w:val="24"/>
           <w:szCs w:val="24"/>
           <w:u w:val="single"/>
           <w:lang w:eastAsia="fr-FR"/>
         </w:rPr>
-        <w:t xml:space="preserve">, </w:t>
-      </w:r>
-      <w:r>
-        <w:rPr>
-          <w:rFonts w:ascii="Aptos" w:hAnsi="Aptos" w:cs="Arial"/>
-          <w:kern w:val="32"/>
-          <w:sz w:val="24"/>
-          <w:szCs w:val="24"/>
-          <w:u w:val="single"/>
-          <w:lang w:eastAsia="fr-FR"/>
-        </w:rPr>
-        <w:t xml:space="preserve">le </w:t>
-      </w:r>
-      <w:r>
-        <w:rPr>
-          <w:rFonts w:ascii="Aptos" w:hAnsi="Aptos" w:cs="Arial"/>
-          <w:kern w:val="2"/>
-          <w:sz w:val="24"/>
-          <w:szCs w:val="24"/>
-          <w:u w:val="single"/>
-          <w:lang w:eastAsia="fr-FR"/>
-        </w:rPr>
-        <w:t>{</w:t>
-      </w:r>
-      <w:proofErr w:type="spellStart"/>
-      <w:r>
-        <w:rPr>
-          <w:rFonts w:ascii="Aptos" w:hAnsi="Aptos" w:cs="Arial"/>
-          <w:kern w:val="2"/>
-          <w:sz w:val="24"/>
-          <w:szCs w:val="24"/>
-          <w:u w:val="single"/>
-          <w:lang w:eastAsia="fr-FR"/>
-        </w:rPr>
-        <w:t>dateSignature</w:t>
-      </w:r>
-      <w:proofErr w:type="spellEnd"/>
-      <w:r>
-        <w:rPr>
-          <w:rFonts w:ascii="Aptos" w:hAnsi="Aptos" w:cs="Arial"/>
-          <w:kern w:val="2"/>
-          <w:sz w:val="24"/>
-          <w:szCs w:val="24"/>
-          <w:u w:val="single"/>
-          <w:lang w:eastAsia="fr-FR"/>
-        </w:rPr>
-        <w:t>}</w:t>
+        <w:t>{dateSignature}</w:t>
       </w:r>
     </w:p>
     <w:p>
@@ -2164,6 +1768,7 @@
         <w:t>ML EXPERTS</w:t>
       </w:r>
     </w:p>
+    <w:p/>
     <w:p>
       <w:pPr>
         <w:pStyle w:val="Heading2"/>
@@ -2228,29 +1833,7 @@
           <w:szCs w:val="22"/>
           <w:lang w:val="en-GB"/>
         </w:rPr>
-        <w:t>{</w:t>
-      </w:r>
-      <w:proofErr w:type="spellStart"/>
-      <w:r>
-        <w:rPr>
-          <w:rFonts w:ascii="Calibri" w:hAnsi="Calibri" w:cs="Calibri"/>
-          <w:b/>
-          <w:iCs/>
-          <w:szCs w:val="22"/>
-          <w:lang w:val="en-GB"/>
-        </w:rPr>
-        <w:t>signataire</w:t>
-      </w:r>
-      <w:proofErr w:type="spellEnd"/>
-      <w:r>
-        <w:rPr>
-          <w:rFonts w:ascii="Calibri" w:hAnsi="Calibri" w:cs="Calibri"/>
-          <w:b/>
-          <w:iCs/>
-          <w:szCs w:val="22"/>
-          <w:lang w:val="en-GB"/>
-        </w:rPr>
-        <w:t>}</w:t>
+        <w:t>{signataire}</w:t>
       </w:r>
     </w:p>
     <w:p>
@@ -2270,7 +1853,6 @@
           <w:lang w:val="en-GB"/>
         </w:rPr>
       </w:pPr>
-      <w:proofErr w:type="spellStart"/>
       <w:r>
         <w:rPr>
           <w:rFonts w:ascii="Calibri" w:hAnsi="Calibri" w:cs="Calibri"/>
@@ -2281,7 +1863,6 @@
         </w:rPr>
         <w:t>Associé</w:t>
       </w:r>
-      <w:proofErr w:type="spellEnd"/>
     </w:p>
     <w:p>
       <w:pPr>
@@ -3670,6 +3251,50 @@
     <w:lsdException w:name="Subtitle" w:qFormat="1"/>
     <w:lsdException w:name="Strong" w:qFormat="1"/>
     <w:lsdException w:name="Emphasis" w:qFormat="1"/>
+    <w:lsdException w:name="Normal Table" w:semiHidden="1" w:unhideWhenUsed="1"/>
+    <w:lsdException w:name="Table Simple 1" w:semiHidden="1" w:unhideWhenUsed="1"/>
+    <w:lsdException w:name="Table Simple 2" w:semiHidden="1" w:unhideWhenUsed="1"/>
+    <w:lsdException w:name="Table Simple 3" w:semiHidden="1" w:unhideWhenUsed="1"/>
+    <w:lsdException w:name="Table Classic 1" w:semiHidden="1" w:unhideWhenUsed="1"/>
+    <w:lsdException w:name="Table Classic 2" w:semiHidden="1" w:unhideWhenUsed="1"/>
+    <w:lsdException w:name="Table Classic 3" w:semiHidden="1" w:unhideWhenUsed="1"/>
+    <w:lsdException w:name="Table Classic 4" w:semiHidden="1" w:unhideWhenUsed="1"/>
+    <w:lsdException w:name="Table Colorful 1" w:semiHidden="1" w:unhideWhenUsed="1"/>
+    <w:lsdException w:name="Table Colorful 2" w:semiHidden="1" w:unhideWhenUsed="1"/>
+    <w:lsdException w:name="Table Colorful 3" w:semiHidden="1" w:unhideWhenUsed="1"/>
+    <w:lsdException w:name="Table Columns 1" w:semiHidden="1" w:unhideWhenUsed="1"/>
+    <w:lsdException w:name="Table Columns 2" w:semiHidden="1" w:unhideWhenUsed="1"/>
+    <w:lsdException w:name="Table Columns 3" w:semiHidden="1" w:unhideWhenUsed="1"/>
+    <w:lsdException w:name="Table Columns 4" w:semiHidden="1" w:unhideWhenUsed="1"/>
+    <w:lsdException w:name="Table Columns 5" w:semiHidden="1" w:unhideWhenUsed="1"/>
+    <w:lsdException w:name="Table Grid 1" w:semiHidden="1" w:unhideWhenUsed="1"/>
+    <w:lsdException w:name="Table Grid 2" w:semiHidden="1" w:unhideWhenUsed="1"/>
+    <w:lsdException w:name="Table Grid 3" w:semiHidden="1" w:unhideWhenUsed="1"/>
+    <w:lsdException w:name="Table Grid 4" w:semiHidden="1" w:unhideWhenUsed="1"/>
+    <w:lsdException w:name="Table Grid 5" w:semiHidden="1" w:unhideWhenUsed="1"/>
+    <w:lsdException w:name="Table Grid 6" w:semiHidden="1" w:unhideWhenUsed="1"/>
+    <w:lsdException w:name="Table Grid 7" w:semiHidden="1" w:unhideWhenUsed="1"/>
+    <w:lsdException w:name="Table Grid 8" w:semiHidden="1" w:unhideWhenUsed="1"/>
+    <w:lsdException w:name="Table List 1" w:semiHidden="1" w:unhideWhenUsed="1"/>
+    <w:lsdException w:name="Table List 2" w:semiHidden="1" w:unhideWhenUsed="1"/>
+    <w:lsdException w:name="Table List 3" w:semiHidden="1" w:unhideWhenUsed="1"/>
+    <w:lsdException w:name="Table List 4" w:semiHidden="1" w:unhideWhenUsed="1"/>
+    <w:lsdException w:name="Table List 5" w:semiHidden="1" w:unhideWhenUsed="1"/>
+    <w:lsdException w:name="Table List 6" w:semiHidden="1" w:unhideWhenUsed="1"/>
+    <w:lsdException w:name="Table List 7" w:semiHidden="1" w:unhideWhenUsed="1"/>
+    <w:lsdException w:name="Table List 8" w:semiHidden="1" w:unhideWhenUsed="1"/>
+    <w:lsdException w:name="Table 3D effects 1" w:semiHidden="1" w:unhideWhenUsed="1"/>
+    <w:lsdException w:name="Table 3D effects 2" w:semiHidden="1" w:unhideWhenUsed="1"/>
+    <w:lsdException w:name="Table 3D effects 3" w:semiHidden="1" w:unhideWhenUsed="1"/>
+    <w:lsdException w:name="Table Contemporary" w:semiHidden="1" w:unhideWhenUsed="1"/>
+    <w:lsdException w:name="Table Elegant" w:semiHidden="1" w:unhideWhenUsed="1"/>
+    <w:lsdException w:name="Table Professional" w:semiHidden="1" w:unhideWhenUsed="1"/>
+    <w:lsdException w:name="Table Subtle 1" w:semiHidden="1" w:unhideWhenUsed="1"/>
+    <w:lsdException w:name="Table Subtle 2" w:semiHidden="1" w:unhideWhenUsed="1"/>
+    <w:lsdException w:name="Table Web 1" w:semiHidden="1" w:unhideWhenUsed="1"/>
+    <w:lsdException w:name="Table Web 2" w:semiHidden="1" w:unhideWhenUsed="1"/>
+    <w:lsdException w:name="Table Web 3" w:semiHidden="1" w:unhideWhenUsed="1"/>
+    <w:lsdException w:name="Table Theme" w:semiHidden="1" w:unhideWhenUsed="1"/>
     <w:lsdException w:name="Placeholder Text" w:semiHidden="1" w:uiPriority="99"/>
     <w:lsdException w:name="No Spacing" w:uiPriority="1" w:qFormat="1"/>
     <w:lsdException w:name="Light Shading" w:uiPriority="60"/>
@@ -3960,11 +3585,15 @@
   </w:style>
   <w:style w:type="character" w:default="1" w:styleId="DefaultParagraphFont">
     <w:name w:val="Default Paragraph Font"/>
+    <w:uiPriority w:val="1"/>
     <w:semiHidden/>
+    <w:unhideWhenUsed/>
   </w:style>
   <w:style w:type="table" w:default="1" w:styleId="TableNormal">
     <w:name w:val="Normal Table"/>
+    <w:uiPriority w:val="99"/>
     <w:semiHidden/>
+    <w:unhideWhenUsed/>
     <w:tblPr>
       <w:tblInd w:w="0" w:type="dxa"/>
       <w:tblCellMar>
@@ -3977,7 +3606,9 @@
   </w:style>
   <w:style w:type="numbering" w:default="1" w:styleId="NoList">
     <w:name w:val="No List"/>
+    <w:uiPriority w:val="99"/>
     <w:semiHidden/>
+    <w:unhideWhenUsed/>
   </w:style>
   <w:style w:type="paragraph" w:styleId="Header">
     <w:name w:val="header"/>
@@ -4064,7 +3695,7 @@
     </w:rPr>
   </w:style>
   <w:style w:type="paragraph" w:customStyle="1" w:styleId="CarCarCarCarCarCarCar">
-    <w:name w:val=" Car Car Car Car Car Car Car"/>
+    <w:name w:val="Car Car Car Car Car Car Car"/>
     <w:basedOn w:val="Normal"/>
     <w:rsid w:val="00CA5DAE"/>
     <w:pPr>

</xml_diff>